<commit_message>
Palmola health Applied and Curry's First Draft
</commit_message>
<xml_diff>
--- a/jobs/paloma_health/KaustubhSonawaneAIEngineer.docx
+++ b/jobs/paloma_health/KaustubhSonawaneAIEngineer.docx
@@ -314,7 +314,7 @@
           <w:sz w:val="22"/>
           <w:szCs w:val="22"/>
         </w:rPr>
-        <w:t xml:space="preserve">AI Engineer with 3 years of industry experience designing, building and shipping LLM-powered applications to internal business users, from RAG and agentic tool-calling systems on Azure OpenAI to the access control, security review and deployment that surround them. De facto team lead for up to 4 interns and twice recognised internally with Best Team Project (2024, 2025). Recently completed an MSc in Data Science at the University of Bristol, highlighted by an algorithmic dissertation project in partnership with AstraZeneca. Seeking to apply my GenAI, Python and cloud engineering experience to build, evaluate and improve AI applications that meet the quality and safety bar of a clinical setting.</w:t>
+        <w:t xml:space="preserve">AI Engineer with 3 years of industry experience designing, building and shipping LLM-powered applications to internal business users and improving them on real user feedback, from RAG and agentic tool-calling systems on Azure OpenAI to the access control, security review and deployment that surround them. De facto team lead for up to 4 interns and twice recognised internally with Best Team Project (2024, 2025). Recently completed an MSc in Data Science at the University of Bristol, highlighted by an algorithmic dissertation project in partnership with AstraZeneca. Seeking to apply my GenAI, Python and cloud engineering experience to build, evaluate and improve AI applications that meet the quality and safety bar of a clinical setting.</w:t>
       </w:r>
     </w:p>
     <w:p>
@@ -998,61 +998,61 @@
           <w:sz w:val="22"/>
           <w:szCs w:val="22"/>
         </w:rPr>
-        <w:t xml:space="preserve">Built </w:t>
-      </w:r>
-      <w:r>
-        <w:rPr>
-          <w:rFonts w:ascii="Times New Roman" w:hAnsi="Times New Roman" w:cs="Times New Roman"/>
-          <w:b/>
-          <w:bCs/>
-          <w:sz w:val="22"/>
-          <w:szCs w:val="22"/>
-        </w:rPr>
-        <w:t xml:space="preserve">agentic tool-calling</w:t>
-      </w:r>
-      <w:r>
-        <w:rPr>
-          <w:rFonts w:ascii="Times New Roman" w:hAnsi="Times New Roman" w:cs="Times New Roman"/>
-          <w:sz w:val="22"/>
-          <w:szCs w:val="22"/>
-        </w:rPr>
-        <w:t xml:space="preserve"> where AI agents call </w:t>
-      </w:r>
-      <w:r>
-        <w:rPr>
-          <w:rFonts w:ascii="Times New Roman" w:hAnsi="Times New Roman" w:cs="Times New Roman"/>
-          <w:b/>
-          <w:bCs/>
-          <w:sz w:val="22"/>
-          <w:szCs w:val="22"/>
-        </w:rPr>
-        <w:t xml:space="preserve">Python functions</w:t>
-      </w:r>
-      <w:r>
-        <w:rPr>
-          <w:rFonts w:ascii="Times New Roman" w:hAnsi="Times New Roman" w:cs="Times New Roman"/>
-          <w:sz w:val="22"/>
-          <w:szCs w:val="22"/>
-        </w:rPr>
-        <w:t xml:space="preserve"> as tools to run SQL-backed fund-comparison calculations and generate </w:t>
-      </w:r>
-      <w:r>
-        <w:rPr>
-          <w:rFonts w:ascii="Times New Roman" w:hAnsi="Times New Roman" w:cs="Times New Roman"/>
-          <w:b/>
-          <w:bCs/>
-          <w:sz w:val="22"/>
-          <w:szCs w:val="22"/>
-        </w:rPr>
-        <w:t xml:space="preserve">PDF</w:t>
-      </w:r>
-      <w:r>
-        <w:rPr>
-          <w:rFonts w:ascii="Times New Roman" w:hAnsi="Times New Roman" w:cs="Times New Roman"/>
-          <w:sz w:val="22"/>
-          <w:szCs w:val="22"/>
-        </w:rPr>
-        <w:t xml:space="preserve"> comparison reports on user request.</w:t>
+        <w:t xml:space="preserve">Released the applications to real users in each department and improved them on their feedback; guardrailed responses through </w:t>
+      </w:r>
+      <w:r>
+        <w:rPr>
+          <w:rFonts w:ascii="Times New Roman" w:hAnsi="Times New Roman" w:cs="Times New Roman"/>
+          <w:b/>
+          <w:bCs/>
+          <w:sz w:val="22"/>
+          <w:szCs w:val="22"/>
+        </w:rPr>
+        <w:t xml:space="preserve">system prompts</w:t>
+      </w:r>
+      <w:r>
+        <w:rPr>
+          <w:rFonts w:ascii="Times New Roman" w:hAnsi="Times New Roman" w:cs="Times New Roman"/>
+          <w:sz w:val="22"/>
+          <w:szCs w:val="22"/>
+        </w:rPr>
+        <w:t xml:space="preserve"> (no fine-tuning), </w:t>
+      </w:r>
+      <w:r>
+        <w:rPr>
+          <w:rFonts w:ascii="Times New Roman" w:hAnsi="Times New Roman" w:cs="Times New Roman"/>
+          <w:b/>
+          <w:bCs/>
+          <w:sz w:val="22"/>
+          <w:szCs w:val="22"/>
+        </w:rPr>
+        <w:t xml:space="preserve">versioned every prompt change in Git</w:t>
+      </w:r>
+      <w:r>
+        <w:rPr>
+          <w:rFonts w:ascii="Times New Roman" w:hAnsi="Times New Roman" w:cs="Times New Roman"/>
+          <w:sz w:val="22"/>
+          <w:szCs w:val="22"/>
+        </w:rPr>
+        <w:t xml:space="preserve">, and had each application reviewed by the </w:t>
+      </w:r>
+      <w:r>
+        <w:rPr>
+          <w:rFonts w:ascii="Times New Roman" w:hAnsi="Times New Roman" w:cs="Times New Roman"/>
+          <w:b/>
+          <w:bCs/>
+          <w:sz w:val="22"/>
+          <w:szCs w:val="22"/>
+        </w:rPr>
+        <w:t xml:space="preserve">Compliance</w:t>
+      </w:r>
+      <w:r>
+        <w:rPr>
+          <w:rFonts w:ascii="Times New Roman" w:hAnsi="Times New Roman" w:cs="Times New Roman"/>
+          <w:sz w:val="22"/>
+          <w:szCs w:val="22"/>
+        </w:rPr>
+        <w:t xml:space="preserve"> department.</w:t>
       </w:r>
     </w:p>
     <w:p>
@@ -1073,7 +1073,82 @@
           <w:sz w:val="22"/>
           <w:szCs w:val="22"/>
         </w:rPr>
-        <w:t xml:space="preserve">Allocated models with cost in mind: </w:t>
+        <w:t xml:space="preserve">Built </w:t>
+      </w:r>
+      <w:r>
+        <w:rPr>
+          <w:rFonts w:ascii="Times New Roman" w:hAnsi="Times New Roman" w:cs="Times New Roman"/>
+          <w:b/>
+          <w:bCs/>
+          <w:sz w:val="22"/>
+          <w:szCs w:val="22"/>
+        </w:rPr>
+        <w:t xml:space="preserve">agentic tool-calling</w:t>
+      </w:r>
+      <w:r>
+        <w:rPr>
+          <w:rFonts w:ascii="Times New Roman" w:hAnsi="Times New Roman" w:cs="Times New Roman"/>
+          <w:sz w:val="22"/>
+          <w:szCs w:val="22"/>
+        </w:rPr>
+        <w:t xml:space="preserve"> where AI agents call </w:t>
+      </w:r>
+      <w:r>
+        <w:rPr>
+          <w:rFonts w:ascii="Times New Roman" w:hAnsi="Times New Roman" w:cs="Times New Roman"/>
+          <w:b/>
+          <w:bCs/>
+          <w:sz w:val="22"/>
+          <w:szCs w:val="22"/>
+        </w:rPr>
+        <w:t xml:space="preserve">Python functions</w:t>
+      </w:r>
+      <w:r>
+        <w:rPr>
+          <w:rFonts w:ascii="Times New Roman" w:hAnsi="Times New Roman" w:cs="Times New Roman"/>
+          <w:sz w:val="22"/>
+          <w:szCs w:val="22"/>
+        </w:rPr>
+        <w:t xml:space="preserve"> as tools to run SQL-backed fund-comparison calculations and generate </w:t>
+      </w:r>
+      <w:r>
+        <w:rPr>
+          <w:rFonts w:ascii="Times New Roman" w:hAnsi="Times New Roman" w:cs="Times New Roman"/>
+          <w:b/>
+          <w:bCs/>
+          <w:sz w:val="22"/>
+          <w:szCs w:val="22"/>
+        </w:rPr>
+        <w:t xml:space="preserve">PDF</w:t>
+      </w:r>
+      <w:r>
+        <w:rPr>
+          <w:rFonts w:ascii="Times New Roman" w:hAnsi="Times New Roman" w:cs="Times New Roman"/>
+          <w:sz w:val="22"/>
+          <w:szCs w:val="22"/>
+        </w:rPr>
+        <w:t xml:space="preserve"> comparison reports on user request.</w:t>
+      </w:r>
+    </w:p>
+    <w:p>
+      <w:pPr>
+        <w:pStyle w:val="ListParagraph"/>
+        <w:numPr>
+          <w:ilvl w:val="0"/>
+          <w:numId w:val="3"/>
+        </w:numPr>
+        <w:rPr>
+          <w:rFonts w:ascii="Times New Roman" w:hAnsi="Times New Roman" w:cs="Times New Roman"/>
+          <w:lang w:val="en-US"/>
+        </w:rPr>
+      </w:pPr>
+      <w:r>
+        <w:rPr>
+          <w:rFonts w:ascii="Times New Roman" w:hAnsi="Times New Roman" w:cs="Times New Roman"/>
+          <w:sz w:val="22"/>
+          <w:szCs w:val="22"/>
+        </w:rPr>
+        <w:t xml:space="preserve">Chose models by cost and stakes: </w:t>
       </w:r>
       <w:r>
         <w:rPr>
@@ -1091,25 +1166,25 @@
           <w:sz w:val="22"/>
           <w:szCs w:val="22"/>
         </w:rPr>
-        <w:t xml:space="preserve"> for the largest department (Client Service) and the </w:t>
-      </w:r>
-      <w:r>
-        <w:rPr>
-          <w:rFonts w:ascii="Times New Roman" w:hAnsi="Times New Roman" w:cs="Times New Roman"/>
-          <w:b/>
-          <w:bCs/>
-          <w:sz w:val="22"/>
-          <w:szCs w:val="22"/>
-        </w:rPr>
-        <w:t xml:space="preserve">Azure OpenAI API</w:t>
-      </w:r>
-      <w:r>
-        <w:rPr>
-          <w:rFonts w:ascii="Times New Roman" w:hAnsi="Times New Roman" w:cs="Times New Roman"/>
-          <w:sz w:val="22"/>
-          <w:szCs w:val="22"/>
-        </w:rPr>
-        <w:t xml:space="preserve"> for the others.</w:t>
+        <w:t xml:space="preserve"> for the largest department (Client Service) to control cost, keeping the stronger </w:t>
+      </w:r>
+      <w:r>
+        <w:rPr>
+          <w:rFonts w:ascii="Times New Roman" w:hAnsi="Times New Roman" w:cs="Times New Roman"/>
+          <w:b/>
+          <w:bCs/>
+          <w:sz w:val="22"/>
+          <w:szCs w:val="22"/>
+        </w:rPr>
+        <w:t xml:space="preserve">Azure OpenAI</w:t>
+      </w:r>
+      <w:r>
+        <w:rPr>
+          <w:rFonts w:ascii="Times New Roman" w:hAnsi="Times New Roman" w:cs="Times New Roman"/>
+          <w:sz w:val="22"/>
+          <w:szCs w:val="22"/>
+        </w:rPr>
+        <w:t xml:space="preserve"> outputs for decision makers, with a design that lets models be switched and scaled.</w:t>
       </w:r>
     </w:p>
     <w:p>
@@ -1153,7 +1228,61 @@
           <w:sz w:val="22"/>
           <w:szCs w:val="22"/>
         </w:rPr>
-        <w:t xml:space="preserve"> automation job using </w:t>
+        <w:t xml:space="preserve"> automation job to parse over </w:t>
+      </w:r>
+      <w:r>
+        <w:rPr>
+          <w:rFonts w:ascii="Times New Roman" w:hAnsi="Times New Roman" w:cs="Times New Roman"/>
+          <w:b/>
+          <w:bCs/>
+          <w:sz w:val="22"/>
+          <w:szCs w:val="22"/>
+        </w:rPr>
+        <w:t xml:space="preserve">300 daily emails</w:t>
+      </w:r>
+      <w:r>
+        <w:rPr>
+          <w:rFonts w:ascii="Times New Roman" w:hAnsi="Times New Roman" w:cs="Times New Roman"/>
+          <w:sz w:val="22"/>
+          <w:szCs w:val="22"/>
+        </w:rPr>
+        <w:t xml:space="preserve"> from credit rating agencies, fuzzy-match them to tracked companies and send analysts a consolidated daily summary, </w:t>
+      </w:r>
+      <w:r>
+        <w:rPr>
+          <w:rFonts w:ascii="Times New Roman" w:hAnsi="Times New Roman" w:cs="Times New Roman"/>
+          <w:b/>
+          <w:bCs/>
+          <w:sz w:val="22"/>
+          <w:szCs w:val="22"/>
+        </w:rPr>
+        <w:t xml:space="preserve">saving 60 manual analyst hours a month</w:t>
+      </w:r>
+      <w:r>
+        <w:rPr>
+          <w:rFonts w:ascii="Times New Roman" w:hAnsi="Times New Roman" w:cs="Times New Roman"/>
+          <w:sz w:val="22"/>
+          <w:szCs w:val="22"/>
+        </w:rPr>
+        <w:t xml:space="preserve">; moved parsing from </w:t>
+      </w:r>
+      <w:r>
+        <w:rPr>
+          <w:rFonts w:ascii="Times New Roman" w:hAnsi="Times New Roman" w:cs="Times New Roman"/>
+          <w:b/>
+          <w:bCs/>
+          <w:sz w:val="22"/>
+          <w:szCs w:val="22"/>
+        </w:rPr>
+        <w:t xml:space="preserve">AWS Textract</w:t>
+      </w:r>
+      <w:r>
+        <w:rPr>
+          <w:rFonts w:ascii="Times New Roman" w:hAnsi="Times New Roman" w:cs="Times New Roman"/>
+          <w:sz w:val="22"/>
+          <w:szCs w:val="22"/>
+        </w:rPr>
+        <w:t xml:space="preserve"> to </w:t>
       </w:r>
       <w:r>
         <w:rPr>
@@ -1171,61 +1300,7 @@
           <w:sz w:val="22"/>
           <w:szCs w:val="22"/>
         </w:rPr>
-        <w:t xml:space="preserve"> (first iteration: </w:t>
-      </w:r>
-      <w:r>
-        <w:rPr>
-          <w:rFonts w:ascii="Times New Roman" w:hAnsi="Times New Roman" w:cs="Times New Roman"/>
-          <w:b/>
-          <w:bCs/>
-          <w:sz w:val="22"/>
-          <w:szCs w:val="22"/>
-        </w:rPr>
-        <w:t xml:space="preserve">AWS Textract</w:t>
-      </w:r>
-      <w:r>
-        <w:rPr>
-          <w:rFonts w:ascii="Times New Roman" w:hAnsi="Times New Roman" w:cs="Times New Roman"/>
-          <w:sz w:val="22"/>
-          <w:szCs w:val="22"/>
-        </w:rPr>
-        <w:t xml:space="preserve">, replaced for accuracy) to parse over </w:t>
-      </w:r>
-      <w:r>
-        <w:rPr>
-          <w:rFonts w:ascii="Times New Roman" w:hAnsi="Times New Roman" w:cs="Times New Roman"/>
-          <w:b/>
-          <w:bCs/>
-          <w:sz w:val="22"/>
-          <w:szCs w:val="22"/>
-        </w:rPr>
-        <w:t xml:space="preserve">300 daily emails</w:t>
-      </w:r>
-      <w:r>
-        <w:rPr>
-          <w:rFonts w:ascii="Times New Roman" w:hAnsi="Times New Roman" w:cs="Times New Roman"/>
-          <w:sz w:val="22"/>
-          <w:szCs w:val="22"/>
-        </w:rPr>
-        <w:t xml:space="preserve"> from credit rating agencies, fuzzy-match them to tracked companies and send analysts a consolidated daily summary, </w:t>
-      </w:r>
-      <w:r>
-        <w:rPr>
-          <w:rFonts w:ascii="Times New Roman" w:hAnsi="Times New Roman" w:cs="Times New Roman"/>
-          <w:b/>
-          <w:bCs/>
-          <w:sz w:val="22"/>
-          <w:szCs w:val="22"/>
-        </w:rPr>
-        <w:t xml:space="preserve">saving 60 manual analyst hours a month</w:t>
-      </w:r>
-      <w:r>
-        <w:rPr>
-          <w:rFonts w:ascii="Times New Roman" w:hAnsi="Times New Roman" w:cs="Times New Roman"/>
-          <w:sz w:val="22"/>
-          <w:szCs w:val="22"/>
-        </w:rPr>
-        <w:t xml:space="preserve">; run on </w:t>
+        <w:t xml:space="preserve"> when a rating agency began sending emails as images, which broke the text parser, and gained much better accuracy; run on </w:t>
       </w:r>
       <w:r>
         <w:rPr>
@@ -1451,7 +1526,7 @@
           <w:sz w:val="22"/>
           <w:szCs w:val="22"/>
         </w:rPr>
-        <w:t xml:space="preserve">; later recreated them in the </w:t>
+        <w:t xml:space="preserve">; recreated in </w:t>
       </w:r>
       <w:r>
         <w:rPr>
@@ -1469,7 +1544,7 @@
           <w:sz w:val="22"/>
           <w:szCs w:val="22"/>
         </w:rPr>
-        <w:t xml:space="preserve"> frontend to make the data available across the organization at lower cost.</w:t>
+        <w:t xml:space="preserve"> to widen access.</w:t>
       </w:r>
     </w:p>
     <w:p>
@@ -1669,7 +1744,7 @@
           <w:sz w:val="22"/>
           <w:szCs w:val="22"/>
         </w:rPr>
-        <w:t xml:space="preserve"> (fortnightly for fixed income, monthly for equity) for every fund in the Indian mutual fund market (2023–2025), integrated with the company's legacy data.</w:t>
+        <w:t xml:space="preserve"> for every fund in the Indian mutual fund market (2023–2025), integrated with the company's legacy data.</w:t>
       </w:r>
     </w:p>
     <w:p>
@@ -1815,7 +1890,7 @@
           <w:sz w:val="22"/>
           <w:szCs w:val="22"/>
         </w:rPr>
-        <w:t xml:space="preserve">, with the FastAPI microservices packaged in </w:t>
+        <w:t xml:space="preserve">, with </w:t>
       </w:r>
       <w:r>
         <w:rPr>
@@ -1833,7 +1908,7 @@
           <w:sz w:val="22"/>
           <w:szCs w:val="22"/>
         </w:rPr>
-        <w:t xml:space="preserve">.</w:t>
+        <w:t xml:space="preserve"> microservices.</w:t>
       </w:r>
     </w:p>
     <w:p>
@@ -1947,7 +2022,7 @@
           <w:sz w:val="22"/>
           <w:szCs w:val="22"/>
         </w:rPr>
-        <w:t xml:space="preserve">Coordinated with the security team on port whitelisting and safeguards, and deployed an </w:t>
+        <w:t xml:space="preserve">Worked with the security team on port whitelisting, and deployed an </w:t>
       </w:r>
       <w:r>
         <w:rPr>
@@ -1965,7 +2040,7 @@
           <w:sz w:val="22"/>
           <w:szCs w:val="22"/>
         </w:rPr>
-        <w:t xml:space="preserve"> reverse proxy as one of the fixes that took the applications from repeatedly failing to passing the security team's </w:t>
+        <w:t xml:space="preserve"> reverse proxy as one of the fixes that took the apps from repeatedly failing to passing </w:t>
       </w:r>
       <w:r>
         <w:rPr>
@@ -2148,7 +2223,7 @@
           <w:szCs w:val="22"/>
           <w:lang w:val="en-US"/>
         </w:rPr>
-        <w:t xml:space="preserve"> CellLineSelector (Team project. Contributed to the data preprocessing pipeline and scoring algorithm of a tool that ranks cancer cell lines based on target inclusion and exclusion genes, with an AI assistant explaining the results.) | GitHub:  https://github.com/Arishtanemi4/az-team25.git | Demo: http://celllineselector-frontend-408937187029.s3-website.eu-west-2.amazonaws.com/</w:t>
+        <w:t xml:space="preserve"> CellLineSelector (Team project, co-built. Data preprocessing pipeline, scoring algorithm and RAG-based AI assistant for a tool that ranks cancer cell lines by target inclusion and exclusion genes; validated and refined with feedback from AstraZeneca scientists.) | GitHub:  https://github.com/Arishtanemi4/az-team25.git | Demo: http://celllineselector-frontend-408937187029.s3-website.eu-west-2.amazonaws.com/</w:t>
       </w:r>
     </w:p>
     <w:p>
@@ -2183,62 +2258,7 @@
           <w:szCs w:val="22"/>
           <w:lang w:val="en-US"/>
         </w:rPr>
-        <w:t xml:space="preserve"> VisionCaptioner (Team project. Multi-phase architecture study comparing CNN/ViT/ResNet encoders and LSTM/attention decoders for generating natural-language image descriptions, benchmarked against BLIP/SigLIP and commercial VLMs using SBERT similarity, BLEU and ROUGE-L.) | GitHub: https://github.com/Arishtanemi4/ata-team30.git </w:t>
-      </w:r>
-    </w:p>
-    <w:p>
-      <w:pPr>
-        <w:pStyle w:val="ListParagraph"/>
-        <w:numPr>
-          <w:ilvl w:val="0"/>
-          <w:numId w:val="8"/>
-        </w:numPr>
-        <w:rPr>
-          <w:rFonts w:ascii="Times New Roman" w:hAnsi="Times New Roman" w:cs="Times New Roman"/>
-          <w:sz w:val="22"/>
-          <w:szCs w:val="22"/>
-          <w:lang w:val="en-US"/>
-        </w:rPr>
-      </w:pPr>
-      <w:r>
-        <w:rPr>
-          <w:rFonts w:ascii="Times New Roman" w:hAnsi="Times New Roman" w:cs="Times New Roman"/>
-          <w:b/>
-          <w:bCs/>
-          <w:sz w:val="22"/>
-          <w:szCs w:val="22"/>
-          <w:lang w:val="en-US"/>
-        </w:rPr>
-        <w:t xml:space="preserve">B.Tech Final Year Project:</w:t>
-      </w:r>
-      <w:r>
-        <w:rPr>
-          <w:rFonts w:ascii="Times New Roman" w:hAnsi="Times New Roman" w:cs="Times New Roman"/>
-          <w:sz w:val="22"/>
-          <w:szCs w:val="22"/>
-          <w:lang w:val="en-US"/>
-        </w:rPr>
-        <w:t xml:space="preserve"> Udacity self-driving car simulator. (A self-driving car trained using a </w:t>
-      </w:r>
-      <w:r>
-        <w:rPr>
-          <w:rFonts w:ascii="Times New Roman" w:hAnsi="Times New Roman" w:cs="Times New Roman"/>
-          <w:b/>
-          <w:bCs/>
-          <w:sz w:val="22"/>
-          <w:szCs w:val="22"/>
-          <w:lang w:val="en-US"/>
-        </w:rPr>
-        <w:t xml:space="preserve">Convolution Neural Network (CNN)</w:t>
-      </w:r>
-      <w:r>
-        <w:rPr>
-          <w:rFonts w:ascii="Times New Roman" w:hAnsi="Times New Roman" w:cs="Times New Roman"/>
-          <w:sz w:val="22"/>
-          <w:szCs w:val="22"/>
-          <w:lang w:val="en-US"/>
-        </w:rPr>
-        <w:t xml:space="preserve"> model.)</w:t>
+        <w:t xml:space="preserve"> VisionCaptioner (Team project. Multi-phase architecture study comparing CNN/ViT/ResNet encoders and LSTM/attention decoders for generating natural-language image descriptions, benchmarked against BLIP/SigLIP and commercial VLMs.) | GitHub: https://github.com/Arishtanemi4/ata-team30.git </w:t>
       </w:r>
     </w:p>
     <w:p>
@@ -2568,20 +2588,6 @@
         </w:rPr>
         <w:t xml:space="preserve"> PostgreSQL (pgvector), SQLite</w:t>
       </w:r>
-    </w:p>
-    <w:p>
-      <w:pPr>
-        <w:pStyle w:val="ListParagraph"/>
-        <w:ind w:left="360"/>
-        <w:rPr>
-          <w:rFonts w:ascii="Times New Roman" w:hAnsi="Times New Roman" w:cs="Times New Roman"/>
-          <w:b/>
-          <w:bCs/>
-          <w:sz w:val="22"/>
-          <w:szCs w:val="22"/>
-          <w:lang w:val="en-US"/>
-        </w:rPr>
-      </w:pPr>
     </w:p>
     <w:sectPr>
       <w:pgSz w:w="11906" w:h="16838"/>

</xml_diff>